<commit_message>
update: refresh CV with optimized 1-page resume (docx and pdf)
</commit_message>
<xml_diff>
--- a/Resume_Ratnesh_Kumar_Singh.docx
+++ b/Resume_Ratnesh_Kumar_Singh.docx
@@ -29,15 +29,21 @@
           </w:tcPr>
           <w:p>
             <w:pPr>
-              <w:spacing w:line="240" w:lineRule="auto"/>
+              <w:spacing w:after="20" w:line="240" w:lineRule="auto"/>
               <w:jc w:val="center"/>
+              <w:rPr>
+                <w:sz w:val="16"/>
+                <w:szCs w:val="16"/>
+              </w:rPr>
             </w:pPr>
             <w:r>
               <w:rPr>
                 <w:noProof/>
+                <w:sz w:val="16"/>
+                <w:szCs w:val="16"/>
               </w:rPr>
               <w:drawing>
-                <wp:inline distT="0" distB="0" distL="0" distR="0" wp14:anchorId="56D6AF7A" wp14:editId="0516CB0B">
+                <wp:inline distT="0" distB="0" distL="0" distR="0" wp14:anchorId="2F654214" wp14:editId="5AA4CB89">
                   <wp:extent cx="1005840" cy="1005840"/>
                   <wp:effectExtent l="0" t="0" r="0" b="0"/>
                   <wp:docPr id="1" name="Picture 1"/>
@@ -75,44 +81,59 @@
           </w:p>
           <w:p>
             <w:pPr>
-              <w:spacing w:after="60" w:line="240" w:lineRule="auto"/>
+              <w:spacing w:after="20" w:line="240" w:lineRule="auto"/>
               <w:jc w:val="center"/>
+              <w:rPr>
+                <w:sz w:val="16"/>
+                <w:szCs w:val="16"/>
+              </w:rPr>
             </w:pPr>
             <w:r>
               <w:rPr>
                 <w:rFonts w:ascii="Segoe UI" w:hAnsi="Segoe UI"/>
                 <w:b/>
                 <w:color w:val="FFFFFF"/>
-                <w:sz w:val="28"/>
+                <w:sz w:val="20"/>
+                <w:szCs w:val="16"/>
               </w:rPr>
               <w:t>Ratnesh Kumar Singh</w:t>
             </w:r>
           </w:p>
           <w:p>
             <w:pPr>
-              <w:spacing w:after="40" w:line="240" w:lineRule="auto"/>
+              <w:spacing w:after="20" w:line="240" w:lineRule="auto"/>
               <w:jc w:val="center"/>
+              <w:rPr>
+                <w:sz w:val="16"/>
+                <w:szCs w:val="16"/>
+              </w:rPr>
             </w:pPr>
             <w:r>
               <w:rPr>
                 <w:rFonts w:ascii="Segoe UI" w:hAnsi="Segoe UI"/>
                 <w:b/>
                 <w:color w:val="3B82F6"/>
-                <w:sz w:val="17"/>
+                <w:sz w:val="12"/>
+                <w:szCs w:val="16"/>
               </w:rPr>
               <w:t>Electronics &amp; Communication Engineer</w:t>
             </w:r>
           </w:p>
           <w:p>
             <w:pPr>
-              <w:spacing w:after="360" w:line="240" w:lineRule="auto"/>
+              <w:spacing w:after="20" w:line="240" w:lineRule="auto"/>
               <w:jc w:val="center"/>
+              <w:rPr>
+                <w:sz w:val="16"/>
+                <w:szCs w:val="16"/>
+              </w:rPr>
             </w:pPr>
             <w:r>
               <w:rPr>
                 <w:rFonts w:ascii="Segoe UI" w:hAnsi="Segoe UI"/>
                 <w:color w:val="94A3B8"/>
-                <w:sz w:val="15"/>
+                <w:sz w:val="9"/>
+                <w:szCs w:val="16"/>
               </w:rPr>
               <w:t>Networking • AI Automation • UI/UX</w:t>
             </w:r>
@@ -122,119 +143,199 @@
               <w:pBdr>
                 <w:bottom w:val="single" w:sz="6" w:space="4" w:color="334155"/>
               </w:pBdr>
-              <w:spacing w:before="200" w:after="120" w:line="240" w:lineRule="auto"/>
+              <w:spacing w:after="20" w:line="240" w:lineRule="auto"/>
+              <w:rPr>
+                <w:sz w:val="16"/>
+                <w:szCs w:val="16"/>
+              </w:rPr>
             </w:pPr>
             <w:r>
               <w:rPr>
                 <w:rFonts w:ascii="Segoe UI" w:hAnsi="Segoe UI"/>
                 <w:b/>
                 <w:color w:val="FFFFFF"/>
-                <w:sz w:val="19"/>
+                <w:sz w:val="14"/>
+                <w:szCs w:val="16"/>
               </w:rPr>
               <w:t>CONTACT</w:t>
             </w:r>
           </w:p>
           <w:p>
             <w:pPr>
-              <w:spacing w:after="80" w:line="240" w:lineRule="auto"/>
+              <w:spacing w:after="20" w:line="240" w:lineRule="auto"/>
+              <w:rPr>
+                <w:sz w:val="16"/>
+                <w:szCs w:val="16"/>
+              </w:rPr>
             </w:pPr>
             <w:r>
               <w:rPr>
                 <w:rFonts w:ascii="Segoe UI" w:hAnsi="Segoe UI"/>
                 <w:color w:val="3B82F6"/>
-                <w:sz w:val="17"/>
+                <w:sz w:val="12"/>
+                <w:szCs w:val="16"/>
               </w:rPr>
-              <w:t xml:space="preserve">📞 </w:t>
+              <w:t>📞</w:t>
+            </w:r>
+            <w:r>
+              <w:rPr>
+                <w:rFonts w:ascii="Segoe UI" w:hAnsi="Segoe UI"/>
+                <w:color w:val="3B82F6"/>
+                <w:sz w:val="12"/>
+                <w:szCs w:val="16"/>
+              </w:rPr>
+              <w:t xml:space="preserve"> </w:t>
             </w:r>
             <w:r>
               <w:rPr>
                 <w:rFonts w:ascii="Segoe UI" w:hAnsi="Segoe UI"/>
                 <w:color w:val="E2E8F0"/>
-                <w:sz w:val="16"/>
+                <w:sz w:val="10"/>
+                <w:szCs w:val="16"/>
               </w:rPr>
               <w:t>+91 70049 37129</w:t>
             </w:r>
           </w:p>
           <w:p>
             <w:pPr>
-              <w:spacing w:after="80" w:line="240" w:lineRule="auto"/>
+              <w:spacing w:after="20" w:line="240" w:lineRule="auto"/>
+              <w:rPr>
+                <w:sz w:val="16"/>
+                <w:szCs w:val="16"/>
+              </w:rPr>
             </w:pPr>
             <w:r>
               <w:rPr>
                 <w:rFonts w:ascii="Segoe UI" w:hAnsi="Segoe UI"/>
                 <w:color w:val="3B82F6"/>
-                <w:sz w:val="17"/>
+                <w:sz w:val="12"/>
+                <w:szCs w:val="16"/>
               </w:rPr>
-              <w:t xml:space="preserve">✉ </w:t>
+              <w:t>✉</w:t>
+            </w:r>
+            <w:r>
+              <w:rPr>
+                <w:rFonts w:ascii="Segoe UI" w:hAnsi="Segoe UI"/>
+                <w:color w:val="3B82F6"/>
+                <w:sz w:val="12"/>
+                <w:szCs w:val="16"/>
+              </w:rPr>
+              <w:t xml:space="preserve"> </w:t>
             </w:r>
             <w:r>
               <w:rPr>
                 <w:rFonts w:ascii="Segoe UI" w:hAnsi="Segoe UI"/>
                 <w:color w:val="E2E8F0"/>
-                <w:sz w:val="16"/>
+                <w:sz w:val="10"/>
+                <w:szCs w:val="16"/>
               </w:rPr>
               <w:t>kumarsinghratnesh3@gmail.com</w:t>
             </w:r>
           </w:p>
           <w:p>
             <w:pPr>
-              <w:spacing w:after="80" w:line="240" w:lineRule="auto"/>
+              <w:spacing w:after="20" w:line="240" w:lineRule="auto"/>
+              <w:rPr>
+                <w:sz w:val="16"/>
+                <w:szCs w:val="16"/>
+              </w:rPr>
             </w:pPr>
             <w:r>
               <w:rPr>
                 <w:rFonts w:ascii="Segoe UI" w:hAnsi="Segoe UI"/>
                 <w:color w:val="3B82F6"/>
-                <w:sz w:val="17"/>
+                <w:sz w:val="12"/>
+                <w:szCs w:val="16"/>
               </w:rPr>
-              <w:t xml:space="preserve">📍 </w:t>
+              <w:t>📍</w:t>
+            </w:r>
+            <w:r>
+              <w:rPr>
+                <w:rFonts w:ascii="Segoe UI" w:hAnsi="Segoe UI"/>
+                <w:color w:val="3B82F6"/>
+                <w:sz w:val="12"/>
+                <w:szCs w:val="16"/>
+              </w:rPr>
+              <w:t xml:space="preserve"> </w:t>
             </w:r>
             <w:r>
               <w:rPr>
                 <w:rFonts w:ascii="Segoe UI" w:hAnsi="Segoe UI"/>
                 <w:color w:val="E2E8F0"/>
-                <w:sz w:val="16"/>
+                <w:sz w:val="10"/>
+                <w:szCs w:val="16"/>
               </w:rPr>
               <w:t>West Bengal, India</w:t>
             </w:r>
           </w:p>
           <w:p>
             <w:pPr>
-              <w:spacing w:after="80" w:line="240" w:lineRule="auto"/>
+              <w:spacing w:after="20" w:line="240" w:lineRule="auto"/>
+              <w:rPr>
+                <w:sz w:val="16"/>
+                <w:szCs w:val="16"/>
+              </w:rPr>
             </w:pPr>
             <w:r>
               <w:rPr>
                 <w:rFonts w:ascii="Segoe UI" w:hAnsi="Segoe UI"/>
                 <w:color w:val="3B82F6"/>
-                <w:sz w:val="17"/>
+                <w:sz w:val="12"/>
+                <w:szCs w:val="16"/>
               </w:rPr>
-              <w:t xml:space="preserve">🌐 </w:t>
+              <w:t>🌐</w:t>
+            </w:r>
+            <w:r>
+              <w:rPr>
+                <w:rFonts w:ascii="Segoe UI" w:hAnsi="Segoe UI"/>
+                <w:color w:val="3B82F6"/>
+                <w:sz w:val="12"/>
+                <w:szCs w:val="16"/>
+              </w:rPr>
+              <w:t xml:space="preserve"> </w:t>
             </w:r>
             <w:r>
               <w:rPr>
                 <w:rFonts w:ascii="Segoe UI" w:hAnsi="Segoe UI"/>
                 <w:color w:val="E2E8F0"/>
-                <w:sz w:val="16"/>
+                <w:sz w:val="10"/>
+                <w:szCs w:val="16"/>
               </w:rPr>
-              <w:t>portfolio-omega.vercel.app</w:t>
+              <w:t>my-portfolio-omega-liart-40.vercel.app</w:t>
             </w:r>
           </w:p>
           <w:p>
             <w:pPr>
-              <w:spacing w:after="80" w:line="240" w:lineRule="auto"/>
+              <w:spacing w:after="20" w:line="240" w:lineRule="auto"/>
+              <w:rPr>
+                <w:sz w:val="16"/>
+                <w:szCs w:val="16"/>
+              </w:rPr>
             </w:pPr>
             <w:r>
               <w:rPr>
                 <w:rFonts w:ascii="Segoe UI" w:hAnsi="Segoe UI"/>
                 <w:color w:val="3B82F6"/>
-                <w:sz w:val="17"/>
+                <w:sz w:val="12"/>
+                <w:szCs w:val="16"/>
               </w:rPr>
-              <w:t xml:space="preserve">🎨 </w:t>
+              <w:t>🎨</w:t>
+            </w:r>
+            <w:r>
+              <w:rPr>
+                <w:rFonts w:ascii="Segoe UI" w:hAnsi="Segoe UI"/>
+                <w:color w:val="3B82F6"/>
+                <w:sz w:val="12"/>
+                <w:szCs w:val="16"/>
+              </w:rPr>
+              <w:t xml:space="preserve"> </w:t>
             </w:r>
             <w:r>
               <w:rPr>
                 <w:rFonts w:ascii="Segoe UI" w:hAnsi="Segoe UI"/>
                 <w:color w:val="E2E8F0"/>
-                <w:sz w:val="16"/>
+                <w:sz w:val="10"/>
+                <w:szCs w:val="16"/>
               </w:rPr>
               <w:t>tinywebs.site/6AsQaP</w:t>
             </w:r>
@@ -244,157 +345,213 @@
               <w:pBdr>
                 <w:bottom w:val="single" w:sz="6" w:space="4" w:color="334155"/>
               </w:pBdr>
-              <w:spacing w:before="200" w:after="120" w:line="240" w:lineRule="auto"/>
+              <w:spacing w:after="20" w:line="240" w:lineRule="auto"/>
+              <w:rPr>
+                <w:sz w:val="16"/>
+                <w:szCs w:val="16"/>
+              </w:rPr>
             </w:pPr>
             <w:r>
               <w:rPr>
                 <w:rFonts w:ascii="Segoe UI" w:hAnsi="Segoe UI"/>
                 <w:b/>
                 <w:color w:val="FFFFFF"/>
-                <w:sz w:val="19"/>
+                <w:sz w:val="14"/>
+                <w:szCs w:val="16"/>
               </w:rPr>
               <w:t>SKILLS &amp; TOOLS</w:t>
             </w:r>
           </w:p>
           <w:p>
             <w:pPr>
-              <w:spacing w:before="60" w:after="20" w:line="240" w:lineRule="auto"/>
+              <w:spacing w:after="20" w:line="240" w:lineRule="auto"/>
+              <w:rPr>
+                <w:sz w:val="16"/>
+                <w:szCs w:val="16"/>
+              </w:rPr>
             </w:pPr>
             <w:r>
               <w:rPr>
                 <w:rFonts w:ascii="Segoe UI" w:hAnsi="Segoe UI"/>
                 <w:b/>
                 <w:color w:val="94A3B8"/>
-                <w:sz w:val="15"/>
+                <w:sz w:val="9"/>
+                <w:szCs w:val="16"/>
               </w:rPr>
               <w:t>NETWORKING &amp; IT</w:t>
             </w:r>
           </w:p>
           <w:p>
             <w:pPr>
-              <w:spacing w:after="100" w:line="240" w:lineRule="auto"/>
+              <w:spacing w:after="20" w:line="240" w:lineRule="auto"/>
+              <w:rPr>
+                <w:sz w:val="16"/>
+                <w:szCs w:val="16"/>
+              </w:rPr>
             </w:pPr>
             <w:r>
               <w:rPr>
                 <w:rFonts w:ascii="Segoe UI" w:hAnsi="Segoe UI"/>
                 <w:color w:val="E2E8F0"/>
-                <w:sz w:val="16"/>
+                <w:sz w:val="10"/>
+                <w:szCs w:val="16"/>
               </w:rPr>
               <w:t>TCP/IP, DNS, Routing &amp; Switching, Cybersecurity</w:t>
             </w:r>
           </w:p>
           <w:p>
             <w:pPr>
-              <w:spacing w:before="60" w:after="20" w:line="240" w:lineRule="auto"/>
+              <w:spacing w:after="20" w:line="240" w:lineRule="auto"/>
+              <w:rPr>
+                <w:sz w:val="16"/>
+                <w:szCs w:val="16"/>
+              </w:rPr>
             </w:pPr>
             <w:r>
               <w:rPr>
                 <w:rFonts w:ascii="Segoe UI" w:hAnsi="Segoe UI"/>
                 <w:b/>
                 <w:color w:val="94A3B8"/>
-                <w:sz w:val="15"/>
+                <w:sz w:val="9"/>
+                <w:szCs w:val="16"/>
               </w:rPr>
               <w:t>PROGRAMMING</w:t>
             </w:r>
           </w:p>
           <w:p>
             <w:pPr>
-              <w:spacing w:after="100" w:line="240" w:lineRule="auto"/>
+              <w:spacing w:after="20" w:line="240" w:lineRule="auto"/>
+              <w:rPr>
+                <w:sz w:val="16"/>
+                <w:szCs w:val="16"/>
+              </w:rPr>
             </w:pPr>
             <w:r>
               <w:rPr>
                 <w:rFonts w:ascii="Segoe UI" w:hAnsi="Segoe UI"/>
                 <w:color w:val="E2E8F0"/>
-                <w:sz w:val="16"/>
+                <w:sz w:val="10"/>
+                <w:szCs w:val="16"/>
               </w:rPr>
               <w:t>C, C++, Python, HTML, CSS, API Integration</w:t>
             </w:r>
           </w:p>
           <w:p>
             <w:pPr>
-              <w:spacing w:before="60" w:after="20" w:line="240" w:lineRule="auto"/>
+              <w:spacing w:after="20" w:line="240" w:lineRule="auto"/>
+              <w:rPr>
+                <w:sz w:val="16"/>
+                <w:szCs w:val="16"/>
+              </w:rPr>
             </w:pPr>
             <w:r>
               <w:rPr>
                 <w:rFonts w:ascii="Segoe UI" w:hAnsi="Segoe UI"/>
                 <w:b/>
                 <w:color w:val="94A3B8"/>
-                <w:sz w:val="15"/>
+                <w:sz w:val="9"/>
+                <w:szCs w:val="16"/>
               </w:rPr>
               <w:t>AI &amp; AUTOMATION</w:t>
             </w:r>
           </w:p>
           <w:p>
             <w:pPr>
-              <w:spacing w:after="100" w:line="240" w:lineRule="auto"/>
+              <w:spacing w:after="20" w:line="240" w:lineRule="auto"/>
+              <w:rPr>
+                <w:sz w:val="16"/>
+                <w:szCs w:val="16"/>
+              </w:rPr>
             </w:pPr>
             <w:r>
               <w:rPr>
                 <w:rFonts w:ascii="Segoe UI" w:hAnsi="Segoe UI"/>
                 <w:color w:val="E2E8F0"/>
-                <w:sz w:val="16"/>
+                <w:sz w:val="10"/>
+                <w:szCs w:val="16"/>
               </w:rPr>
               <w:t>n8n, Google AI Studio, OpenAI, AI Agents</w:t>
             </w:r>
           </w:p>
           <w:p>
             <w:pPr>
-              <w:spacing w:before="60" w:after="20" w:line="240" w:lineRule="auto"/>
+              <w:spacing w:after="20" w:line="240" w:lineRule="auto"/>
+              <w:rPr>
+                <w:sz w:val="16"/>
+                <w:szCs w:val="16"/>
+              </w:rPr>
             </w:pPr>
             <w:r>
               <w:rPr>
                 <w:rFonts w:ascii="Segoe UI" w:hAnsi="Segoe UI"/>
                 <w:b/>
                 <w:color w:val="94A3B8"/>
-                <w:sz w:val="15"/>
+                <w:sz w:val="9"/>
+                <w:szCs w:val="16"/>
               </w:rPr>
               <w:t>EMBEDDED &amp; ENG.</w:t>
             </w:r>
           </w:p>
           <w:p>
             <w:pPr>
-              <w:spacing w:after="100" w:line="240" w:lineRule="auto"/>
+              <w:spacing w:after="20" w:line="240" w:lineRule="auto"/>
+              <w:rPr>
+                <w:sz w:val="16"/>
+                <w:szCs w:val="16"/>
+              </w:rPr>
             </w:pPr>
             <w:r>
               <w:rPr>
                 <w:rFonts w:ascii="Segoe UI" w:hAnsi="Segoe UI"/>
                 <w:color w:val="E2E8F0"/>
-                <w:sz w:val="16"/>
+                <w:sz w:val="10"/>
+                <w:szCs w:val="16"/>
               </w:rPr>
-              <w:t>Arduino, MATLAB, Tinkercad, Verilog, ArcGIS</w:t>
+              <w:t xml:space="preserve">Arduino, MATLAB, </w:t>
             </w:r>
             <w:r>
               <w:rPr>
                 <w:rFonts w:ascii="Segoe UI" w:hAnsi="Segoe UI"/>
                 <w:color w:val="E2E8F0"/>
-                <w:sz w:val="16"/>
+                <w:sz w:val="10"/>
+                <w:szCs w:val="16"/>
               </w:rPr>
-              <w:t>, HFSS Simulation</w:t>
+              <w:t>Tinkercad, Verilog, ArcGIS</w:t>
             </w:r>
           </w:p>
           <w:p>
             <w:pPr>
-              <w:spacing w:before="60" w:after="20" w:line="240" w:lineRule="auto"/>
+              <w:spacing w:after="20" w:line="240" w:lineRule="auto"/>
+              <w:rPr>
+                <w:sz w:val="16"/>
+                <w:szCs w:val="16"/>
+              </w:rPr>
             </w:pPr>
             <w:r>
               <w:rPr>
                 <w:rFonts w:ascii="Segoe UI" w:hAnsi="Segoe UI"/>
                 <w:b/>
                 <w:color w:val="94A3B8"/>
-                <w:sz w:val="15"/>
+                <w:sz w:val="9"/>
+                <w:szCs w:val="16"/>
               </w:rPr>
               <w:t>UI/UX &amp; DESIGN</w:t>
             </w:r>
           </w:p>
           <w:p>
             <w:pPr>
-              <w:spacing w:after="100" w:line="240" w:lineRule="auto"/>
+              <w:spacing w:after="20" w:line="240" w:lineRule="auto"/>
+              <w:rPr>
+                <w:sz w:val="16"/>
+                <w:szCs w:val="16"/>
+              </w:rPr>
             </w:pPr>
             <w:r>
               <w:rPr>
                 <w:rFonts w:ascii="Segoe UI" w:hAnsi="Segoe UI"/>
                 <w:color w:val="E2E8F0"/>
-                <w:sz w:val="16"/>
+                <w:sz w:val="10"/>
+                <w:szCs w:val="16"/>
               </w:rPr>
               <w:t>Figma, Wireframing, Prototyping, Canva</w:t>
             </w:r>
@@ -404,58 +561,105 @@
               <w:pBdr>
                 <w:bottom w:val="single" w:sz="6" w:space="4" w:color="334155"/>
               </w:pBdr>
-              <w:spacing w:before="200" w:after="120" w:line="240" w:lineRule="auto"/>
+              <w:spacing w:after="20" w:line="240" w:lineRule="auto"/>
+              <w:rPr>
+                <w:sz w:val="16"/>
+                <w:szCs w:val="16"/>
+              </w:rPr>
             </w:pPr>
             <w:r>
               <w:rPr>
                 <w:rFonts w:ascii="Segoe UI" w:hAnsi="Segoe UI"/>
                 <w:b/>
                 <w:color w:val="FFFFFF"/>
-                <w:sz w:val="19"/>
+                <w:sz w:val="14"/>
+                <w:szCs w:val="16"/>
               </w:rPr>
               <w:t>LANGUAGES</w:t>
             </w:r>
           </w:p>
           <w:p>
             <w:pPr>
-              <w:spacing w:after="60" w:line="240" w:lineRule="auto"/>
+              <w:spacing w:after="20" w:line="240" w:lineRule="auto"/>
+              <w:rPr>
+                <w:sz w:val="16"/>
+                <w:szCs w:val="16"/>
+              </w:rPr>
             </w:pPr>
             <w:r>
               <w:rPr>
                 <w:rFonts w:ascii="Segoe UI" w:hAnsi="Segoe UI"/>
                 <w:b/>
                 <w:color w:val="FFFFFF"/>
-                <w:sz w:val="17"/>
+                <w:sz w:val="12"/>
+                <w:szCs w:val="16"/>
               </w:rPr>
               <w:t xml:space="preserve">English </w:t>
+            </w:r>
+            <w:r>
+              <w:rPr>
+                <w:rFonts w:ascii="Segoe UI" w:hAnsi="Segoe UI"/>
+                <w:color w:val="94A3B8"/>
+                <w:sz w:val="10"/>
+                <w:szCs w:val="16"/>
+              </w:rPr>
+              <w:t>(Professional)</w:t>
             </w:r>
           </w:p>
           <w:p>
             <w:pPr>
-              <w:spacing w:after="60" w:line="240" w:lineRule="auto"/>
+              <w:spacing w:after="20" w:line="240" w:lineRule="auto"/>
+              <w:rPr>
+                <w:sz w:val="16"/>
+                <w:szCs w:val="16"/>
+              </w:rPr>
             </w:pPr>
             <w:r>
               <w:rPr>
                 <w:rFonts w:ascii="Segoe UI" w:hAnsi="Segoe UI"/>
                 <w:b/>
                 <w:color w:val="FFFFFF"/>
-                <w:sz w:val="17"/>
+                <w:sz w:val="12"/>
+                <w:szCs w:val="16"/>
               </w:rPr>
               <w:t xml:space="preserve">Hindi </w:t>
+            </w:r>
+            <w:r>
+              <w:rPr>
+                <w:rFonts w:ascii="Segoe UI" w:hAnsi="Segoe UI"/>
+                <w:color w:val="94A3B8"/>
+                <w:sz w:val="10"/>
+                <w:szCs w:val="16"/>
+              </w:rPr>
+              <w:t>(Native)</w:t>
             </w:r>
           </w:p>
           <w:p>
             <w:pPr>
-              <w:spacing w:after="60" w:line="240" w:lineRule="auto"/>
+              <w:spacing w:after="20" w:line="240" w:lineRule="auto"/>
+              <w:rPr>
+                <w:sz w:val="16"/>
+                <w:szCs w:val="16"/>
+              </w:rPr>
             </w:pPr>
             <w:r>
               <w:rPr>
                 <w:rFonts w:ascii="Segoe UI" w:hAnsi="Segoe UI"/>
                 <w:b/>
                 <w:color w:val="FFFFFF"/>
-                <w:sz w:val="17"/>
+                <w:sz w:val="12"/>
+                <w:szCs w:val="16"/>
               </w:rPr>
               <w:t xml:space="preserve">Bengali </w:t>
+            </w:r>
+            <w:r>
+              <w:rPr>
+                <w:rFonts w:ascii="Segoe UI" w:hAnsi="Segoe UI"/>
+                <w:color w:val="94A3B8"/>
+                <w:sz w:val="10"/>
+                <w:szCs w:val="16"/>
+              </w:rPr>
+              <w:t>(Conversational)</w:t>
             </w:r>
           </w:p>
           <w:p>
@@ -463,27 +667,37 @@
               <w:pBdr>
                 <w:bottom w:val="single" w:sz="6" w:space="4" w:color="334155"/>
               </w:pBdr>
-              <w:spacing w:before="200" w:after="120" w:line="240" w:lineRule="auto"/>
+              <w:spacing w:after="20" w:line="240" w:lineRule="auto"/>
+              <w:rPr>
+                <w:sz w:val="16"/>
+                <w:szCs w:val="16"/>
+              </w:rPr>
             </w:pPr>
             <w:r>
               <w:rPr>
                 <w:rFonts w:ascii="Segoe UI" w:hAnsi="Segoe UI"/>
                 <w:b/>
                 <w:color w:val="FFFFFF"/>
-                <w:sz w:val="19"/>
+                <w:sz w:val="14"/>
+                <w:szCs w:val="16"/>
               </w:rPr>
               <w:t>INTERESTS</w:t>
             </w:r>
           </w:p>
           <w:p>
             <w:pPr>
-              <w:spacing w:after="80" w:line="240" w:lineRule="auto"/>
+              <w:spacing w:after="20" w:line="240" w:lineRule="auto"/>
+              <w:rPr>
+                <w:sz w:val="16"/>
+                <w:szCs w:val="16"/>
+              </w:rPr>
             </w:pPr>
             <w:r>
               <w:rPr>
                 <w:rFonts w:ascii="Segoe UI" w:hAnsi="Segoe UI"/>
                 <w:color w:val="E2E8F0"/>
-                <w:sz w:val="16"/>
+                <w:sz w:val="10"/>
+                <w:szCs w:val="16"/>
               </w:rPr>
               <w:t>Photography, Sketching, Audio &amp; Video Editing, Tech Trends</w:t>
             </w:r>
@@ -505,37 +719,67 @@
               <w:pBdr>
                 <w:bottom w:val="single" w:sz="12" w:space="4" w:color="DBEAFE"/>
               </w:pBdr>
-              <w:spacing w:after="120" w:line="240" w:lineRule="auto"/>
+              <w:spacing w:after="20" w:line="240" w:lineRule="auto"/>
+              <w:rPr>
+                <w:sz w:val="16"/>
+                <w:szCs w:val="16"/>
+              </w:rPr>
             </w:pPr>
             <w:r>
               <w:rPr>
                 <w:rFonts w:ascii="Segoe UI" w:hAnsi="Segoe UI"/>
                 <w:color w:val="2563EB"/>
-                <w:sz w:val="21"/>
+                <w:sz w:val="16"/>
+                <w:szCs w:val="16"/>
               </w:rPr>
-              <w:t xml:space="preserve">👤 </w:t>
+              <w:t>👤</w:t>
+            </w:r>
+            <w:r>
+              <w:rPr>
+                <w:rFonts w:ascii="Segoe UI" w:hAnsi="Segoe UI"/>
+                <w:color w:val="2563EB"/>
+                <w:sz w:val="16"/>
+                <w:szCs w:val="16"/>
+              </w:rPr>
+              <w:t xml:space="preserve"> </w:t>
             </w:r>
             <w:r>
               <w:rPr>
                 <w:rFonts w:ascii="Segoe UI" w:hAnsi="Segoe UI"/>
                 <w:b/>
                 <w:color w:val="1E3A8A"/>
+                <w:sz w:val="16"/>
+                <w:szCs w:val="16"/>
               </w:rPr>
               <w:t>PROFILE SUMMARY</w:t>
             </w:r>
           </w:p>
           <w:p>
             <w:pPr>
-              <w:spacing w:after="160" w:line="240" w:lineRule="auto"/>
+              <w:spacing w:after="20" w:line="240" w:lineRule="auto"/>
               <w:jc w:val="both"/>
+              <w:rPr>
+                <w:sz w:val="16"/>
+                <w:szCs w:val="16"/>
+              </w:rPr>
             </w:pPr>
             <w:r>
               <w:rPr>
                 <w:rFonts w:ascii="Segoe UI" w:hAnsi="Segoe UI"/>
                 <w:color w:val="475569"/>
-                <w:sz w:val="19"/>
+                <w:sz w:val="14"/>
+                <w:szCs w:val="16"/>
               </w:rPr>
-              <w:t>Motivated Electronics &amp; Communication Engineering graduate (2026) with a versatile skillset spanning networking, IT infrastructure, AI automation, and UI/UX design. Experienced in developing embedded hardware prototypes, designing user interfaces in Figma, and programming in Python/C++. Strong understanding of networking concepts (TCP/IP, routing), V2X communication, and workflow automation. Eager to contribute to technology-driven roles across networking, software development, or systems integration. Open to relocation across India.</w:t>
+              <w:t xml:space="preserve">Motivated Electronics &amp; Communication Engineering graduate (2026) with a versatile skillset spanning networking, IT infrastructure, AI automation, and UI/UX design. Experienced in developing embedded hardware prototypes, designing user interfaces in Figma, and programming in Python/C++. Strong understanding of networking concepts (TCP/IP, routing), V2X communication, and workflow automation. Eager to contribute to technology-driven roles across networking, software development, or systems integration. Open </w:t>
+            </w:r>
+            <w:r>
+              <w:rPr>
+                <w:rFonts w:ascii="Segoe UI" w:hAnsi="Segoe UI"/>
+                <w:color w:val="475569"/>
+                <w:sz w:val="14"/>
+                <w:szCs w:val="16"/>
+              </w:rPr>
+              <w:t>to relocation across India.</w:t>
             </w:r>
           </w:p>
           <w:p>
@@ -543,109 +787,152 @@
               <w:pBdr>
                 <w:bottom w:val="single" w:sz="12" w:space="4" w:color="DBEAFE"/>
               </w:pBdr>
-              <w:spacing w:before="240" w:after="120" w:line="240" w:lineRule="auto"/>
+              <w:spacing w:after="20" w:line="240" w:lineRule="auto"/>
+              <w:rPr>
+                <w:sz w:val="16"/>
+                <w:szCs w:val="16"/>
+              </w:rPr>
             </w:pPr>
             <w:r>
               <w:rPr>
                 <w:rFonts w:ascii="Segoe UI" w:hAnsi="Segoe UI"/>
                 <w:color w:val="2563EB"/>
-                <w:sz w:val="21"/>
+                <w:sz w:val="16"/>
+                <w:szCs w:val="16"/>
               </w:rPr>
-              <w:t xml:space="preserve">💼 </w:t>
+              <w:t>💼</w:t>
+            </w:r>
+            <w:r>
+              <w:rPr>
+                <w:rFonts w:ascii="Segoe UI" w:hAnsi="Segoe UI"/>
+                <w:color w:val="2563EB"/>
+                <w:sz w:val="16"/>
+                <w:szCs w:val="16"/>
+              </w:rPr>
+              <w:t xml:space="preserve"> </w:t>
             </w:r>
             <w:r>
               <w:rPr>
                 <w:rFonts w:ascii="Segoe UI" w:hAnsi="Segoe UI"/>
                 <w:b/>
                 <w:color w:val="1E3A8A"/>
+                <w:sz w:val="16"/>
+                <w:szCs w:val="16"/>
               </w:rPr>
               <w:t>KEY PROJECTS</w:t>
             </w:r>
           </w:p>
           <w:p>
             <w:pPr>
-              <w:spacing w:before="80" w:after="20" w:line="240" w:lineRule="auto"/>
+              <w:spacing w:after="20" w:line="240" w:lineRule="auto"/>
+              <w:rPr>
+                <w:sz w:val="16"/>
+                <w:szCs w:val="16"/>
+              </w:rPr>
             </w:pPr>
             <w:r>
               <w:rPr>
                 <w:rFonts w:ascii="Segoe UI" w:hAnsi="Segoe UI"/>
                 <w:b/>
                 <w:color w:val="0F172A"/>
-                <w:sz w:val="19"/>
+                <w:sz w:val="14"/>
+                <w:szCs w:val="16"/>
               </w:rPr>
-              <w:t xml:space="preserve">Adaptive Smart Antenna (V2X) </w:t>
+              <w:t xml:space="preserve">Adaptive Smart Antenna System (V2X) </w:t>
             </w:r>
             <w:r>
               <w:rPr>
                 <w:rFonts w:ascii="Segoe UI" w:hAnsi="Segoe UI"/>
                 <w:b/>
                 <w:color w:val="2563EB"/>
-                <w:sz w:val="17"/>
+                <w:sz w:val="12"/>
+                <w:szCs w:val="16"/>
               </w:rPr>
-              <w:t>(V2X • ECE Hardware)</w:t>
+              <w:t>(MATLAB • V2X • ECE Hardware)</w:t>
             </w:r>
           </w:p>
           <w:p>
             <w:pPr>
-              <w:spacing w:after="100" w:line="240" w:lineRule="auto"/>
+              <w:spacing w:after="20" w:line="240" w:lineRule="auto"/>
               <w:jc w:val="both"/>
+              <w:rPr>
+                <w:sz w:val="16"/>
+                <w:szCs w:val="16"/>
+              </w:rPr>
             </w:pPr>
             <w:r>
               <w:rPr>
                 <w:rFonts w:ascii="Segoe UI" w:hAnsi="Segoe UI"/>
                 <w:color w:val="475569"/>
-                <w:sz w:val="18"/>
+                <w:sz w:val="12"/>
+                <w:szCs w:val="16"/>
               </w:rPr>
               <w:t>Designed and developed an adaptive smart antenna system prototype to improve wireless communication reliability in high-mobility vehicular environments. Implemented beamforming algorithms that dynamically direct signals toward moving vehicles, helping reduce interference and maintain stable connectivity. Supporting emerging V2X (Vehicle-to-Everything) standards.</w:t>
             </w:r>
           </w:p>
           <w:p>
             <w:pPr>
-              <w:spacing w:before="80" w:after="20" w:line="240" w:lineRule="auto"/>
+              <w:spacing w:after="20" w:line="240" w:lineRule="auto"/>
+              <w:rPr>
+                <w:sz w:val="16"/>
+                <w:szCs w:val="16"/>
+              </w:rPr>
             </w:pPr>
             <w:r>
               <w:rPr>
                 <w:rFonts w:ascii="Segoe UI" w:hAnsi="Segoe UI"/>
                 <w:b/>
                 <w:color w:val="0F172A"/>
-                <w:sz w:val="19"/>
+                <w:sz w:val="14"/>
+                <w:szCs w:val="16"/>
               </w:rPr>
-              <w:t xml:space="preserve">AI Assistant </w:t>
+              <w:t xml:space="preserve">Simple AI Assistant </w:t>
             </w:r>
             <w:r>
               <w:rPr>
                 <w:rFonts w:ascii="Segoe UI" w:hAnsi="Segoe UI"/>
                 <w:b/>
                 <w:color w:val="2563EB"/>
-                <w:sz w:val="17"/>
+                <w:sz w:val="12"/>
+                <w:szCs w:val="16"/>
               </w:rPr>
               <w:t>(Python • APIs • Conversational AI)</w:t>
             </w:r>
           </w:p>
           <w:p>
             <w:pPr>
-              <w:spacing w:after="100" w:line="240" w:lineRule="auto"/>
+              <w:spacing w:after="20" w:line="240" w:lineRule="auto"/>
               <w:jc w:val="both"/>
+              <w:rPr>
+                <w:sz w:val="16"/>
+                <w:szCs w:val="16"/>
+              </w:rPr>
             </w:pPr>
             <w:r>
               <w:rPr>
                 <w:rFonts w:ascii="Segoe UI" w:hAnsi="Segoe UI"/>
                 <w:color w:val="475569"/>
-                <w:sz w:val="18"/>
+                <w:sz w:val="12"/>
+                <w:szCs w:val="16"/>
               </w:rPr>
               <w:t>Created an intelligent assistant using Python and API integrations. Implemented features like natural language command understanding, conversational response generation, and real-time information retrieval, demonstrating client-server communication and data handling skills.</w:t>
             </w:r>
           </w:p>
           <w:p>
             <w:pPr>
-              <w:spacing w:before="80" w:after="20" w:line="240" w:lineRule="auto"/>
+              <w:spacing w:after="20" w:line="240" w:lineRule="auto"/>
+              <w:rPr>
+                <w:sz w:val="16"/>
+                <w:szCs w:val="16"/>
+              </w:rPr>
             </w:pPr>
             <w:r>
               <w:rPr>
                 <w:rFonts w:ascii="Segoe UI" w:hAnsi="Segoe UI"/>
                 <w:b/>
                 <w:color w:val="0F172A"/>
-                <w:sz w:val="19"/>
+                <w:sz w:val="14"/>
+                <w:szCs w:val="16"/>
               </w:rPr>
               <w:t xml:space="preserve">Smart Parking System </w:t>
             </w:r>
@@ -654,35 +941,46 @@
                 <w:rFonts w:ascii="Segoe UI" w:hAnsi="Segoe UI"/>
                 <w:b/>
                 <w:color w:val="2563EB"/>
-                <w:sz w:val="17"/>
+                <w:sz w:val="12"/>
+                <w:szCs w:val="16"/>
               </w:rPr>
               <w:t>(Arduino • Ultrasonic Sensors • IoT)</w:t>
             </w:r>
           </w:p>
           <w:p>
             <w:pPr>
-              <w:spacing w:after="100" w:line="240" w:lineRule="auto"/>
+              <w:spacing w:after="20" w:line="240" w:lineRule="auto"/>
               <w:jc w:val="both"/>
+              <w:rPr>
+                <w:sz w:val="16"/>
+                <w:szCs w:val="16"/>
+              </w:rPr>
             </w:pPr>
             <w:r>
               <w:rPr>
                 <w:rFonts w:ascii="Segoe UI" w:hAnsi="Segoe UI"/>
                 <w:color w:val="475569"/>
-                <w:sz w:val="18"/>
+                <w:sz w:val="12"/>
+                <w:szCs w:val="16"/>
               </w:rPr>
               <w:t>Designed an IoT prototype using Arduino and ultrasonic sensors to detect available parking spaces in real-time, demonstrating practical sensor integration and network communication.</w:t>
             </w:r>
           </w:p>
           <w:p>
             <w:pPr>
-              <w:spacing w:before="80" w:after="20" w:line="240" w:lineRule="auto"/>
+              <w:spacing w:after="20" w:line="240" w:lineRule="auto"/>
+              <w:rPr>
+                <w:sz w:val="16"/>
+                <w:szCs w:val="16"/>
+              </w:rPr>
             </w:pPr>
             <w:r>
               <w:rPr>
                 <w:rFonts w:ascii="Segoe UI" w:hAnsi="Segoe UI"/>
                 <w:b/>
                 <w:color w:val="0F172A"/>
-                <w:sz w:val="19"/>
+                <w:sz w:val="14"/>
+                <w:szCs w:val="16"/>
               </w:rPr>
               <w:t xml:space="preserve">UI/UX Design &amp; Portfolio Website </w:t>
             </w:r>
@@ -691,21 +989,27 @@
                 <w:rFonts w:ascii="Segoe UI" w:hAnsi="Segoe UI"/>
                 <w:b/>
                 <w:color w:val="2563EB"/>
-                <w:sz w:val="17"/>
+                <w:sz w:val="12"/>
+                <w:szCs w:val="16"/>
               </w:rPr>
               <w:t>(Figma • HTML • CSS • Vercel)</w:t>
             </w:r>
           </w:p>
           <w:p>
             <w:pPr>
-              <w:spacing w:after="100" w:line="240" w:lineRule="auto"/>
+              <w:spacing w:after="20" w:line="240" w:lineRule="auto"/>
               <w:jc w:val="both"/>
+              <w:rPr>
+                <w:sz w:val="16"/>
+                <w:szCs w:val="16"/>
+              </w:rPr>
             </w:pPr>
             <w:r>
               <w:rPr>
                 <w:rFonts w:ascii="Segoe UI" w:hAnsi="Segoe UI"/>
                 <w:color w:val="475569"/>
-                <w:sz w:val="18"/>
+                <w:sz w:val="12"/>
+                <w:szCs w:val="16"/>
               </w:rPr>
               <w:t>Designed multi-screen UI layouts and interactive prototypes in Figma, enforcing accessibility and typography guidelines. Developed and deployed a clean, responsive portfolio website on Vercel.</w:t>
             </w:r>
@@ -715,21 +1019,37 @@
               <w:pBdr>
                 <w:bottom w:val="single" w:sz="12" w:space="4" w:color="DBEAFE"/>
               </w:pBdr>
-              <w:spacing w:before="240" w:after="120" w:line="240" w:lineRule="auto"/>
+              <w:spacing w:after="20" w:line="240" w:lineRule="auto"/>
+              <w:rPr>
+                <w:sz w:val="16"/>
+                <w:szCs w:val="16"/>
+              </w:rPr>
             </w:pPr>
             <w:r>
               <w:rPr>
                 <w:rFonts w:ascii="Segoe UI" w:hAnsi="Segoe UI"/>
                 <w:color w:val="2563EB"/>
-                <w:sz w:val="21"/>
+                <w:sz w:val="16"/>
+                <w:szCs w:val="16"/>
               </w:rPr>
-              <w:t xml:space="preserve">🎓 </w:t>
+              <w:t>🎓</w:t>
+            </w:r>
+            <w:r>
+              <w:rPr>
+                <w:rFonts w:ascii="Segoe UI" w:hAnsi="Segoe UI"/>
+                <w:color w:val="2563EB"/>
+                <w:sz w:val="16"/>
+                <w:szCs w:val="16"/>
+              </w:rPr>
+              <w:t xml:space="preserve"> </w:t>
             </w:r>
             <w:r>
               <w:rPr>
                 <w:rFonts w:ascii="Segoe UI" w:hAnsi="Segoe UI"/>
                 <w:b/>
                 <w:color w:val="1E3A8A"/>
+                <w:sz w:val="16"/>
+                <w:szCs w:val="16"/>
               </w:rPr>
               <w:t>EDUCATION</w:t>
             </w:r>
@@ -761,14 +1081,19 @@
                 </w:tcPr>
                 <w:p>
                   <w:pPr>
-                    <w:spacing w:after="0" w:line="240" w:lineRule="auto"/>
+                    <w:spacing w:after="20" w:line="240" w:lineRule="auto"/>
+                    <w:rPr>
+                      <w:sz w:val="16"/>
+                      <w:szCs w:val="16"/>
+                    </w:rPr>
                   </w:pPr>
                   <w:r>
                     <w:rPr>
                       <w:rFonts w:ascii="Segoe UI" w:hAnsi="Segoe UI"/>
                       <w:b/>
                       <w:color w:val="475569"/>
-                      <w:sz w:val="17"/>
+                      <w:sz w:val="12"/>
+                      <w:szCs w:val="16"/>
                     </w:rPr>
                     <w:t>Qual.</w:t>
                   </w:r>
@@ -787,14 +1112,19 @@
                 </w:tcPr>
                 <w:p>
                   <w:pPr>
-                    <w:spacing w:after="0" w:line="240" w:lineRule="auto"/>
+                    <w:spacing w:after="20" w:line="240" w:lineRule="auto"/>
+                    <w:rPr>
+                      <w:sz w:val="16"/>
+                      <w:szCs w:val="16"/>
+                    </w:rPr>
                   </w:pPr>
                   <w:r>
                     <w:rPr>
                       <w:rFonts w:ascii="Segoe UI" w:hAnsi="Segoe UI"/>
                       <w:b/>
                       <w:color w:val="475569"/>
-                      <w:sz w:val="17"/>
+                      <w:sz w:val="12"/>
+                      <w:szCs w:val="16"/>
                     </w:rPr>
                     <w:t>Institution</w:t>
                   </w:r>
@@ -813,14 +1143,19 @@
                 </w:tcPr>
                 <w:p>
                   <w:pPr>
-                    <w:spacing w:after="0" w:line="240" w:lineRule="auto"/>
+                    <w:spacing w:after="20" w:line="240" w:lineRule="auto"/>
+                    <w:rPr>
+                      <w:sz w:val="16"/>
+                      <w:szCs w:val="16"/>
+                    </w:rPr>
                   </w:pPr>
                   <w:r>
                     <w:rPr>
                       <w:rFonts w:ascii="Segoe UI" w:hAnsi="Segoe UI"/>
                       <w:b/>
                       <w:color w:val="475569"/>
-                      <w:sz w:val="17"/>
+                      <w:sz w:val="12"/>
+                      <w:szCs w:val="16"/>
                     </w:rPr>
                     <w:t>Board/University</w:t>
                   </w:r>
@@ -839,14 +1174,19 @@
                 </w:tcPr>
                 <w:p>
                   <w:pPr>
-                    <w:spacing w:after="0" w:line="240" w:lineRule="auto"/>
+                    <w:spacing w:after="20" w:line="240" w:lineRule="auto"/>
+                    <w:rPr>
+                      <w:sz w:val="16"/>
+                      <w:szCs w:val="16"/>
+                    </w:rPr>
                   </w:pPr>
                   <w:r>
                     <w:rPr>
                       <w:rFonts w:ascii="Segoe UI" w:hAnsi="Segoe UI"/>
                       <w:b/>
                       <w:color w:val="475569"/>
-                      <w:sz w:val="17"/>
+                      <w:sz w:val="12"/>
+                      <w:szCs w:val="16"/>
                     </w:rPr>
                     <w:t>Year</w:t>
                   </w:r>
@@ -865,14 +1205,19 @@
                 </w:tcPr>
                 <w:p>
                   <w:pPr>
-                    <w:spacing w:after="0" w:line="240" w:lineRule="auto"/>
+                    <w:spacing w:after="20" w:line="240" w:lineRule="auto"/>
+                    <w:rPr>
+                      <w:sz w:val="16"/>
+                      <w:szCs w:val="16"/>
+                    </w:rPr>
                   </w:pPr>
                   <w:r>
                     <w:rPr>
                       <w:rFonts w:ascii="Segoe UI" w:hAnsi="Segoe UI"/>
                       <w:b/>
                       <w:color w:val="475569"/>
-                      <w:sz w:val="17"/>
+                      <w:sz w:val="12"/>
+                      <w:szCs w:val="16"/>
                     </w:rPr>
                     <w:t>Specialization</w:t>
                   </w:r>
@@ -892,14 +1237,19 @@
                 </w:tcPr>
                 <w:p>
                   <w:pPr>
-                    <w:spacing w:after="0" w:line="240" w:lineRule="auto"/>
+                    <w:spacing w:after="20" w:line="240" w:lineRule="auto"/>
+                    <w:rPr>
+                      <w:sz w:val="16"/>
+                      <w:szCs w:val="16"/>
+                    </w:rPr>
                   </w:pPr>
                   <w:r>
                     <w:rPr>
                       <w:rFonts w:ascii="Segoe UI" w:hAnsi="Segoe UI"/>
                       <w:b/>
                       <w:color w:val="0F172A"/>
-                      <w:sz w:val="17"/>
+                      <w:sz w:val="12"/>
+                      <w:szCs w:val="16"/>
                     </w:rPr>
                     <w:t>B.Tech</w:t>
                   </w:r>
@@ -917,13 +1267,18 @@
                 </w:tcPr>
                 <w:p>
                   <w:pPr>
-                    <w:spacing w:after="0" w:line="240" w:lineRule="auto"/>
+                    <w:spacing w:after="20" w:line="240" w:lineRule="auto"/>
+                    <w:rPr>
+                      <w:sz w:val="16"/>
+                      <w:szCs w:val="16"/>
+                    </w:rPr>
                   </w:pPr>
                   <w:r>
                     <w:rPr>
                       <w:rFonts w:ascii="Segoe UI" w:hAnsi="Segoe UI"/>
                       <w:color w:val="475569"/>
-                      <w:sz w:val="17"/>
+                      <w:sz w:val="12"/>
+                      <w:szCs w:val="16"/>
                     </w:rPr>
                     <w:t>Swami Vivekananda Inst. of Sci. &amp; Tech.</w:t>
                   </w:r>
@@ -941,13 +1296,18 @@
                 </w:tcPr>
                 <w:p>
                   <w:pPr>
-                    <w:spacing w:after="0" w:line="240" w:lineRule="auto"/>
+                    <w:spacing w:after="20" w:line="240" w:lineRule="auto"/>
+                    <w:rPr>
+                      <w:sz w:val="16"/>
+                      <w:szCs w:val="16"/>
+                    </w:rPr>
                   </w:pPr>
                   <w:r>
                     <w:rPr>
                       <w:rFonts w:ascii="Segoe UI" w:hAnsi="Segoe UI"/>
                       <w:color w:val="475569"/>
-                      <w:sz w:val="17"/>
+                      <w:sz w:val="12"/>
+                      <w:szCs w:val="16"/>
                     </w:rPr>
                     <w:t>MAKAUT (W.B.U.T.)</w:t>
                   </w:r>
@@ -965,13 +1325,18 @@
                 </w:tcPr>
                 <w:p>
                   <w:pPr>
-                    <w:spacing w:after="0" w:line="240" w:lineRule="auto"/>
+                    <w:spacing w:after="20" w:line="240" w:lineRule="auto"/>
+                    <w:rPr>
+                      <w:sz w:val="16"/>
+                      <w:szCs w:val="16"/>
+                    </w:rPr>
                   </w:pPr>
                   <w:r>
                     <w:rPr>
                       <w:rFonts w:ascii="Segoe UI" w:hAnsi="Segoe UI"/>
                       <w:color w:val="475569"/>
-                      <w:sz w:val="17"/>
+                      <w:sz w:val="12"/>
+                      <w:szCs w:val="16"/>
                     </w:rPr>
                     <w:t>2022 - 2026</w:t>
                   </w:r>
@@ -989,13 +1354,18 @@
                 </w:tcPr>
                 <w:p>
                   <w:pPr>
-                    <w:spacing w:after="0" w:line="240" w:lineRule="auto"/>
+                    <w:spacing w:after="20" w:line="240" w:lineRule="auto"/>
+                    <w:rPr>
+                      <w:sz w:val="16"/>
+                      <w:szCs w:val="16"/>
+                    </w:rPr>
                   </w:pPr>
                   <w:r>
                     <w:rPr>
                       <w:rFonts w:ascii="Segoe UI" w:hAnsi="Segoe UI"/>
                       <w:color w:val="475569"/>
-                      <w:sz w:val="17"/>
+                      <w:sz w:val="12"/>
+                      <w:szCs w:val="16"/>
                     </w:rPr>
                     <w:t>ECE</w:t>
                   </w:r>
@@ -1015,14 +1385,19 @@
                 </w:tcPr>
                 <w:p>
                   <w:pPr>
-                    <w:spacing w:after="0" w:line="240" w:lineRule="auto"/>
+                    <w:spacing w:after="20" w:line="240" w:lineRule="auto"/>
+                    <w:rPr>
+                      <w:sz w:val="16"/>
+                      <w:szCs w:val="16"/>
+                    </w:rPr>
                   </w:pPr>
                   <w:r>
                     <w:rPr>
                       <w:rFonts w:ascii="Segoe UI" w:hAnsi="Segoe UI"/>
                       <w:b/>
                       <w:color w:val="0F172A"/>
-                      <w:sz w:val="17"/>
+                      <w:sz w:val="12"/>
+                      <w:szCs w:val="16"/>
                     </w:rPr>
                     <w:t>12th Std</w:t>
                   </w:r>
@@ -1040,13 +1415,18 @@
                 </w:tcPr>
                 <w:p>
                   <w:pPr>
-                    <w:spacing w:after="0" w:line="240" w:lineRule="auto"/>
+                    <w:spacing w:after="20" w:line="240" w:lineRule="auto"/>
+                    <w:rPr>
+                      <w:sz w:val="16"/>
+                      <w:szCs w:val="16"/>
+                    </w:rPr>
                   </w:pPr>
                   <w:r>
                     <w:rPr>
                       <w:rFonts w:ascii="Segoe UI" w:hAnsi="Segoe UI"/>
                       <w:color w:val="475569"/>
-                      <w:sz w:val="17"/>
+                      <w:sz w:val="12"/>
+                      <w:szCs w:val="16"/>
                     </w:rPr>
                     <w:t>P.B.S College</w:t>
                   </w:r>
@@ -1064,13 +1444,18 @@
                 </w:tcPr>
                 <w:p>
                   <w:pPr>
-                    <w:spacing w:after="0" w:line="240" w:lineRule="auto"/>
+                    <w:spacing w:after="20" w:line="240" w:lineRule="auto"/>
+                    <w:rPr>
+                      <w:sz w:val="16"/>
+                      <w:szCs w:val="16"/>
+                    </w:rPr>
                   </w:pPr>
                   <w:r>
                     <w:rPr>
                       <w:rFonts w:ascii="Segoe UI" w:hAnsi="Segoe UI"/>
                       <w:color w:val="475569"/>
-                      <w:sz w:val="17"/>
+                      <w:sz w:val="12"/>
+                      <w:szCs w:val="16"/>
                     </w:rPr>
                     <w:t>B.S.E.B</w:t>
                   </w:r>
@@ -1088,13 +1473,18 @@
                 </w:tcPr>
                 <w:p>
                   <w:pPr>
-                    <w:spacing w:after="0" w:line="240" w:lineRule="auto"/>
+                    <w:spacing w:after="20" w:line="240" w:lineRule="auto"/>
+                    <w:rPr>
+                      <w:sz w:val="16"/>
+                      <w:szCs w:val="16"/>
+                    </w:rPr>
                   </w:pPr>
                   <w:r>
                     <w:rPr>
                       <w:rFonts w:ascii="Segoe UI" w:hAnsi="Segoe UI"/>
                       <w:color w:val="475569"/>
-                      <w:sz w:val="17"/>
+                      <w:sz w:val="12"/>
+                      <w:szCs w:val="16"/>
                     </w:rPr>
                     <w:t>2020</w:t>
                   </w:r>
@@ -1112,13 +1502,18 @@
                 </w:tcPr>
                 <w:p>
                   <w:pPr>
-                    <w:spacing w:after="0" w:line="240" w:lineRule="auto"/>
+                    <w:spacing w:after="20" w:line="240" w:lineRule="auto"/>
+                    <w:rPr>
+                      <w:sz w:val="16"/>
+                      <w:szCs w:val="16"/>
+                    </w:rPr>
                   </w:pPr>
                   <w:r>
                     <w:rPr>
                       <w:rFonts w:ascii="Segoe UI" w:hAnsi="Segoe UI"/>
                       <w:color w:val="475569"/>
-                      <w:sz w:val="17"/>
+                      <w:sz w:val="12"/>
+                      <w:szCs w:val="16"/>
                     </w:rPr>
                     <w:t>Science (PCM)</w:t>
                   </w:r>
@@ -1138,14 +1533,19 @@
                 </w:tcPr>
                 <w:p>
                   <w:pPr>
-                    <w:spacing w:after="0" w:line="240" w:lineRule="auto"/>
+                    <w:spacing w:after="20" w:line="240" w:lineRule="auto"/>
+                    <w:rPr>
+                      <w:sz w:val="16"/>
+                      <w:szCs w:val="16"/>
+                    </w:rPr>
                   </w:pPr>
                   <w:r>
                     <w:rPr>
                       <w:rFonts w:ascii="Segoe UI" w:hAnsi="Segoe UI"/>
                       <w:b/>
                       <w:color w:val="0F172A"/>
-                      <w:sz w:val="17"/>
+                      <w:sz w:val="12"/>
+                      <w:szCs w:val="16"/>
                     </w:rPr>
                     <w:t>10th Std</w:t>
                   </w:r>
@@ -1163,15 +1563,29 @@
                 </w:tcPr>
                 <w:p>
                   <w:pPr>
-                    <w:spacing w:after="0" w:line="240" w:lineRule="auto"/>
+                    <w:spacing w:after="20" w:line="240" w:lineRule="auto"/>
+                    <w:rPr>
+                      <w:sz w:val="16"/>
+                      <w:szCs w:val="16"/>
+                    </w:rPr>
                   </w:pPr>
                   <w:r>
                     <w:rPr>
                       <w:rFonts w:ascii="Segoe UI" w:hAnsi="Segoe UI"/>
                       <w:color w:val="475569"/>
-                      <w:sz w:val="17"/>
+                      <w:sz w:val="12"/>
+                      <w:szCs w:val="16"/>
                     </w:rPr>
-                    <w:t>Vidyanjali High School (H.S.)</w:t>
+                    <w:t xml:space="preserve">Vidyanjali High </w:t>
+                  </w:r>
+                  <w:r>
+                    <w:rPr>
+                      <w:rFonts w:ascii="Segoe UI" w:hAnsi="Segoe UI"/>
+                      <w:color w:val="475569"/>
+                      <w:sz w:val="12"/>
+                      <w:szCs w:val="16"/>
+                    </w:rPr>
+                    <w:t>School (H.S.)</w:t>
                   </w:r>
                 </w:p>
               </w:tc>
@@ -1187,13 +1601,18 @@
                 </w:tcPr>
                 <w:p>
                   <w:pPr>
-                    <w:spacing w:after="0" w:line="240" w:lineRule="auto"/>
+                    <w:spacing w:after="20" w:line="240" w:lineRule="auto"/>
+                    <w:rPr>
+                      <w:sz w:val="16"/>
+                      <w:szCs w:val="16"/>
+                    </w:rPr>
                   </w:pPr>
                   <w:r>
                     <w:rPr>
                       <w:rFonts w:ascii="Segoe UI" w:hAnsi="Segoe UI"/>
                       <w:color w:val="475569"/>
-                      <w:sz w:val="17"/>
+                      <w:sz w:val="12"/>
+                      <w:szCs w:val="16"/>
                     </w:rPr>
                     <w:t>I.G.C.S.E</w:t>
                   </w:r>
@@ -1211,13 +1630,18 @@
                 </w:tcPr>
                 <w:p>
                   <w:pPr>
-                    <w:spacing w:after="0" w:line="240" w:lineRule="auto"/>
+                    <w:spacing w:after="20" w:line="240" w:lineRule="auto"/>
+                    <w:rPr>
+                      <w:sz w:val="16"/>
+                      <w:szCs w:val="16"/>
+                    </w:rPr>
                   </w:pPr>
                   <w:r>
                     <w:rPr>
                       <w:rFonts w:ascii="Segoe UI" w:hAnsi="Segoe UI"/>
                       <w:color w:val="475569"/>
-                      <w:sz w:val="17"/>
+                      <w:sz w:val="12"/>
+                      <w:szCs w:val="16"/>
                     </w:rPr>
                     <w:t>2018</w:t>
                   </w:r>
@@ -1235,13 +1659,18 @@
                 </w:tcPr>
                 <w:p>
                   <w:pPr>
-                    <w:spacing w:after="0" w:line="240" w:lineRule="auto"/>
+                    <w:spacing w:after="20" w:line="240" w:lineRule="auto"/>
+                    <w:rPr>
+                      <w:sz w:val="16"/>
+                      <w:szCs w:val="16"/>
+                    </w:rPr>
                   </w:pPr>
                   <w:r>
                     <w:rPr>
                       <w:rFonts w:ascii="Segoe UI" w:hAnsi="Segoe UI"/>
                       <w:color w:val="475569"/>
-                      <w:sz w:val="17"/>
+                      <w:sz w:val="12"/>
+                      <w:szCs w:val="16"/>
                     </w:rPr>
                     <w:t>Science</w:t>
                   </w:r>
@@ -1249,32 +1678,42 @@
               </w:tc>
             </w:tr>
           </w:tbl>
-          <w:p/>
-          <w:p>
-            <w:pPr>
-              <w:spacing w:before="80" w:after="0" w:line="240" w:lineRule="auto"/>
-            </w:pPr>
-          </w:p>
           <w:p>
             <w:pPr>
               <w:pBdr>
                 <w:bottom w:val="single" w:sz="12" w:space="4" w:color="DBEAFE"/>
               </w:pBdr>
-              <w:spacing w:before="240" w:after="120" w:line="240" w:lineRule="auto"/>
+              <w:spacing w:after="20" w:line="240" w:lineRule="auto"/>
+              <w:rPr>
+                <w:sz w:val="16"/>
+                <w:szCs w:val="16"/>
+              </w:rPr>
             </w:pPr>
             <w:r>
               <w:rPr>
                 <w:rFonts w:ascii="Segoe UI" w:hAnsi="Segoe UI"/>
                 <w:color w:val="2563EB"/>
-                <w:sz w:val="21"/>
+                <w:sz w:val="16"/>
+                <w:szCs w:val="16"/>
               </w:rPr>
-              <w:t xml:space="preserve">📜 </w:t>
+              <w:t>📜</w:t>
+            </w:r>
+            <w:r>
+              <w:rPr>
+                <w:rFonts w:ascii="Segoe UI" w:hAnsi="Segoe UI"/>
+                <w:color w:val="2563EB"/>
+                <w:sz w:val="16"/>
+                <w:szCs w:val="16"/>
+              </w:rPr>
+              <w:t xml:space="preserve"> </w:t>
             </w:r>
             <w:r>
               <w:rPr>
                 <w:rFonts w:ascii="Segoe UI" w:hAnsi="Segoe UI"/>
                 <w:b/>
                 <w:color w:val="1E3A8A"/>
+                <w:sz w:val="16"/>
+                <w:szCs w:val="16"/>
               </w:rPr>
               <w:t>CERTIFICATIONS &amp; TRAINING</w:t>
             </w:r>
@@ -1303,27 +1742,37 @@
                 </w:tcPr>
                 <w:p>
                   <w:pPr>
-                    <w:spacing w:after="0" w:line="240" w:lineRule="auto"/>
+                    <w:spacing w:after="20" w:line="240" w:lineRule="auto"/>
+                    <w:rPr>
+                      <w:sz w:val="16"/>
+                      <w:szCs w:val="16"/>
+                    </w:rPr>
                   </w:pPr>
                   <w:r>
                     <w:rPr>
                       <w:rFonts w:ascii="Segoe UI" w:hAnsi="Segoe UI"/>
                       <w:b/>
                       <w:color w:val="0F172A"/>
-                      <w:sz w:val="17"/>
+                      <w:sz w:val="12"/>
+                      <w:szCs w:val="16"/>
                     </w:rPr>
                     <w:t>Python Programming</w:t>
                   </w:r>
                 </w:p>
                 <w:p>
                   <w:pPr>
-                    <w:spacing w:after="0" w:line="240" w:lineRule="auto"/>
+                    <w:spacing w:after="20" w:line="240" w:lineRule="auto"/>
+                    <w:rPr>
+                      <w:sz w:val="16"/>
+                      <w:szCs w:val="16"/>
+                    </w:rPr>
                   </w:pPr>
                   <w:r>
                     <w:rPr>
                       <w:rFonts w:ascii="Segoe UI" w:hAnsi="Segoe UI"/>
                       <w:color w:val="64748B"/>
-                      <w:sz w:val="16"/>
+                      <w:sz w:val="10"/>
+                      <w:szCs w:val="16"/>
                     </w:rPr>
                     <w:t>1-Month Course</w:t>
                   </w:r>
@@ -1342,27 +1791,37 @@
                 </w:tcPr>
                 <w:p>
                   <w:pPr>
-                    <w:spacing w:after="0" w:line="240" w:lineRule="auto"/>
+                    <w:spacing w:after="20" w:line="240" w:lineRule="auto"/>
+                    <w:rPr>
+                      <w:sz w:val="16"/>
+                      <w:szCs w:val="16"/>
+                    </w:rPr>
                   </w:pPr>
                   <w:r>
                     <w:rPr>
                       <w:rFonts w:ascii="Segoe UI" w:hAnsi="Segoe UI"/>
                       <w:b/>
                       <w:color w:val="0F172A"/>
-                      <w:sz w:val="17"/>
+                      <w:sz w:val="12"/>
+                      <w:szCs w:val="16"/>
                     </w:rPr>
                     <w:t>C Language Programming</w:t>
                   </w:r>
                 </w:p>
                 <w:p>
                   <w:pPr>
-                    <w:spacing w:after="0" w:line="240" w:lineRule="auto"/>
+                    <w:spacing w:after="20" w:line="240" w:lineRule="auto"/>
+                    <w:rPr>
+                      <w:sz w:val="16"/>
+                      <w:szCs w:val="16"/>
+                    </w:rPr>
                   </w:pPr>
                   <w:r>
                     <w:rPr>
                       <w:rFonts w:ascii="Segoe UI" w:hAnsi="Segoe UI"/>
                       <w:color w:val="64748B"/>
-                      <w:sz w:val="16"/>
+                      <w:sz w:val="10"/>
+                      <w:szCs w:val="16"/>
                     </w:rPr>
                     <w:t>1-Month Course</w:t>
                   </w:r>
@@ -1383,27 +1842,37 @@
                 </w:tcPr>
                 <w:p>
                   <w:pPr>
-                    <w:spacing w:after="0" w:line="240" w:lineRule="auto"/>
+                    <w:spacing w:after="20" w:line="240" w:lineRule="auto"/>
+                    <w:rPr>
+                      <w:sz w:val="16"/>
+                      <w:szCs w:val="16"/>
+                    </w:rPr>
                   </w:pPr>
                   <w:r>
                     <w:rPr>
                       <w:rFonts w:ascii="Segoe UI" w:hAnsi="Segoe UI"/>
                       <w:b/>
                       <w:color w:val="0F172A"/>
-                      <w:sz w:val="17"/>
+                      <w:sz w:val="12"/>
+                      <w:szCs w:val="16"/>
                     </w:rPr>
                     <w:t>Electric Vehicle Service Tech.</w:t>
                   </w:r>
                 </w:p>
                 <w:p>
                   <w:pPr>
-                    <w:spacing w:after="0" w:line="240" w:lineRule="auto"/>
+                    <w:spacing w:after="20" w:line="240" w:lineRule="auto"/>
+                    <w:rPr>
+                      <w:sz w:val="16"/>
+                      <w:szCs w:val="16"/>
+                    </w:rPr>
                   </w:pPr>
                   <w:r>
                     <w:rPr>
                       <w:rFonts w:ascii="Segoe UI" w:hAnsi="Segoe UI"/>
                       <w:color w:val="64748B"/>
-                      <w:sz w:val="16"/>
+                      <w:sz w:val="10"/>
+                      <w:szCs w:val="16"/>
                     </w:rPr>
                     <w:t>1-Month Training</w:t>
                   </w:r>
@@ -1422,27 +1891,37 @@
                 </w:tcPr>
                 <w:p>
                   <w:pPr>
-                    <w:spacing w:after="0" w:line="240" w:lineRule="auto"/>
+                    <w:spacing w:after="20" w:line="240" w:lineRule="auto"/>
+                    <w:rPr>
+                      <w:sz w:val="16"/>
+                      <w:szCs w:val="16"/>
+                    </w:rPr>
                   </w:pPr>
                   <w:r>
                     <w:rPr>
                       <w:rFonts w:ascii="Segoe UI" w:hAnsi="Segoe UI"/>
                       <w:b/>
                       <w:color w:val="0F172A"/>
-                      <w:sz w:val="17"/>
+                      <w:sz w:val="12"/>
+                      <w:szCs w:val="16"/>
                     </w:rPr>
                     <w:t>GIS (Geographic Info. Systems)</w:t>
                   </w:r>
                 </w:p>
                 <w:p>
                   <w:pPr>
-                    <w:spacing w:after="0" w:line="240" w:lineRule="auto"/>
+                    <w:spacing w:after="20" w:line="240" w:lineRule="auto"/>
+                    <w:rPr>
+                      <w:sz w:val="16"/>
+                      <w:szCs w:val="16"/>
+                    </w:rPr>
                   </w:pPr>
                   <w:r>
                     <w:rPr>
                       <w:rFonts w:ascii="Segoe UI" w:hAnsi="Segoe UI"/>
                       <w:color w:val="64748B"/>
-                      <w:sz w:val="16"/>
+                      <w:sz w:val="10"/>
+                      <w:szCs w:val="16"/>
                     </w:rPr>
                     <w:t>2-Weeks Training</w:t>
                   </w:r>
@@ -1450,55 +1929,80 @@
               </w:tc>
             </w:tr>
           </w:tbl>
-          <w:p/>
-          <w:p>
-            <w:pPr>
-              <w:spacing w:before="80" w:after="0" w:line="240" w:lineRule="auto"/>
-            </w:pPr>
-          </w:p>
           <w:p>
             <w:pPr>
               <w:pBdr>
                 <w:bottom w:val="single" w:sz="12" w:space="4" w:color="DBEAFE"/>
               </w:pBdr>
-              <w:spacing w:before="240" w:after="120" w:line="240" w:lineRule="auto"/>
+              <w:spacing w:after="20" w:line="240" w:lineRule="auto"/>
+              <w:rPr>
+                <w:sz w:val="16"/>
+                <w:szCs w:val="16"/>
+              </w:rPr>
             </w:pPr>
             <w:r>
               <w:rPr>
                 <w:rFonts w:ascii="Segoe UI" w:hAnsi="Segoe UI"/>
                 <w:color w:val="2563EB"/>
-                <w:sz w:val="21"/>
+                <w:sz w:val="16"/>
+                <w:szCs w:val="16"/>
               </w:rPr>
-              <w:t xml:space="preserve">👥 </w:t>
+              <w:t>👥</w:t>
+            </w:r>
+            <w:r>
+              <w:rPr>
+                <w:rFonts w:ascii="Segoe UI" w:hAnsi="Segoe UI"/>
+                <w:color w:val="2563EB"/>
+                <w:sz w:val="16"/>
+                <w:szCs w:val="16"/>
+              </w:rPr>
+              <w:t xml:space="preserve"> </w:t>
             </w:r>
             <w:r>
               <w:rPr>
                 <w:rFonts w:ascii="Segoe UI" w:hAnsi="Segoe UI"/>
                 <w:b/>
                 <w:color w:val="1E3A8A"/>
+                <w:sz w:val="16"/>
+                <w:szCs w:val="16"/>
               </w:rPr>
               <w:t>EXTRA-CURRICULAR ACTIVITIES</w:t>
             </w:r>
           </w:p>
           <w:p>
             <w:pPr>
-              <w:spacing w:after="60" w:line="240" w:lineRule="auto"/>
+              <w:spacing w:after="20" w:line="240" w:lineRule="auto"/>
               <w:ind w:left="216" w:hanging="216"/>
+              <w:rPr>
+                <w:sz w:val="16"/>
+                <w:szCs w:val="16"/>
+              </w:rPr>
             </w:pPr>
             <w:r>
               <w:rPr>
                 <w:rFonts w:ascii="Segoe UI" w:hAnsi="Segoe UI"/>
                 <w:color w:val="2563EB"/>
-                <w:sz w:val="17"/>
+                <w:sz w:val="12"/>
+                <w:szCs w:val="16"/>
               </w:rPr>
-              <w:t xml:space="preserve">▪  </w:t>
+              <w:t>▪</w:t>
+            </w:r>
+            <w:r>
+              <w:rPr>
+                <w:rFonts w:ascii="Segoe UI" w:hAnsi="Segoe UI"/>
+                <w:color w:val="2563EB"/>
+                <w:sz w:val="12"/>
+                <w:szCs w:val="16"/>
+              </w:rPr>
+              <w:t xml:space="preserve">  </w:t>
             </w:r>
             <w:r>
               <w:rPr>
                 <w:rFonts w:ascii="Segoe UI" w:hAnsi="Segoe UI"/>
                 <w:b/>
                 <w:color w:val="0F172A"/>
-                <w:sz w:val="18"/>
+                <w:sz w:val="12"/>
+                <w:szCs w:val="16"/>
               </w:rPr>
               <w:t xml:space="preserve">HAM Radio: </w:t>
             </w:r>
@@ -1506,30 +2010,46 @@
               <w:rPr>
                 <w:rFonts w:ascii="Segoe UI" w:hAnsi="Segoe UI"/>
                 <w:color w:val="475569"/>
-                <w:sz w:val="18"/>
+                <w:sz w:val="12"/>
+                <w:szCs w:val="16"/>
               </w:rPr>
               <w:t>Workshop on Innovation &amp; General Awareness (2025).</w:t>
             </w:r>
           </w:p>
           <w:p>
             <w:pPr>
-              <w:spacing w:after="60" w:line="240" w:lineRule="auto"/>
+              <w:spacing w:after="20" w:line="240" w:lineRule="auto"/>
               <w:ind w:left="216" w:hanging="216"/>
+              <w:rPr>
+                <w:sz w:val="16"/>
+                <w:szCs w:val="16"/>
+              </w:rPr>
             </w:pPr>
             <w:r>
               <w:rPr>
                 <w:rFonts w:ascii="Segoe UI" w:hAnsi="Segoe UI"/>
                 <w:color w:val="2563EB"/>
-                <w:sz w:val="17"/>
+                <w:sz w:val="12"/>
+                <w:szCs w:val="16"/>
               </w:rPr>
-              <w:t xml:space="preserve">▪  </w:t>
+              <w:t>▪</w:t>
+            </w:r>
+            <w:r>
+              <w:rPr>
+                <w:rFonts w:ascii="Segoe UI" w:hAnsi="Segoe UI"/>
+                <w:color w:val="2563EB"/>
+                <w:sz w:val="12"/>
+                <w:szCs w:val="16"/>
+              </w:rPr>
+              <w:t xml:space="preserve">  </w:t>
             </w:r>
             <w:r>
               <w:rPr>
                 <w:rFonts w:ascii="Segoe UI" w:hAnsi="Segoe UI"/>
                 <w:b/>
                 <w:color w:val="0F172A"/>
-                <w:sz w:val="18"/>
+                <w:sz w:val="12"/>
+                <w:szCs w:val="16"/>
               </w:rPr>
               <w:t xml:space="preserve">BSNL Telecom: </w:t>
             </w:r>
@@ -1537,30 +2057,46 @@
               <w:rPr>
                 <w:rFonts w:ascii="Segoe UI" w:hAnsi="Segoe UI"/>
                 <w:color w:val="475569"/>
-                <w:sz w:val="18"/>
+                <w:sz w:val="12"/>
+                <w:szCs w:val="16"/>
               </w:rPr>
               <w:t>Completed a one-day industrial visit at BSNL Telecom (2025).</w:t>
             </w:r>
           </w:p>
           <w:p>
             <w:pPr>
-              <w:spacing w:after="60" w:line="240" w:lineRule="auto"/>
+              <w:spacing w:after="20" w:line="240" w:lineRule="auto"/>
               <w:ind w:left="216" w:hanging="216"/>
+              <w:rPr>
+                <w:sz w:val="16"/>
+                <w:szCs w:val="16"/>
+              </w:rPr>
             </w:pPr>
             <w:r>
               <w:rPr>
                 <w:rFonts w:ascii="Segoe UI" w:hAnsi="Segoe UI"/>
                 <w:color w:val="2563EB"/>
-                <w:sz w:val="17"/>
+                <w:sz w:val="12"/>
+                <w:szCs w:val="16"/>
               </w:rPr>
-              <w:t xml:space="preserve">▪  </w:t>
+              <w:t>▪</w:t>
+            </w:r>
+            <w:r>
+              <w:rPr>
+                <w:rFonts w:ascii="Segoe UI" w:hAnsi="Segoe UI"/>
+                <w:color w:val="2563EB"/>
+                <w:sz w:val="12"/>
+                <w:szCs w:val="16"/>
+              </w:rPr>
+              <w:t xml:space="preserve">  </w:t>
             </w:r>
             <w:r>
               <w:rPr>
                 <w:rFonts w:ascii="Segoe UI" w:hAnsi="Segoe UI"/>
                 <w:b/>
                 <w:color w:val="0F172A"/>
-                <w:sz w:val="18"/>
+                <w:sz w:val="12"/>
+                <w:szCs w:val="16"/>
               </w:rPr>
               <w:t xml:space="preserve">Cyber Security: </w:t>
             </w:r>
@@ -1568,7 +2104,8 @@
               <w:rPr>
                 <w:rFonts w:ascii="Segoe UI" w:hAnsi="Segoe UI"/>
                 <w:color w:val="475569"/>
-                <w:sz w:val="18"/>
+                <w:sz w:val="12"/>
+                <w:szCs w:val="16"/>
               </w:rPr>
               <w:t>Workshop 'Empower Yourself With Cyber Awareness' (2025).</w:t>
             </w:r>
@@ -1576,10 +2113,17 @@
         </w:tc>
       </w:tr>
     </w:tbl>
-    <w:p/>
+    <w:p>
+      <w:pPr>
+        <w:spacing w:after="0" w:line="240" w:lineRule="auto"/>
+        <w:rPr>
+          <w:sz w:val="2"/>
+        </w:rPr>
+      </w:pPr>
+    </w:p>
     <w:sectPr>
       <w:pgSz w:w="11909" w:h="16834"/>
-      <w:pgMar w:top="360" w:right="360" w:bottom="360" w:left="360" w:header="720" w:footer="720" w:gutter="0"/>
+      <w:pgMar w:top="288" w:right="288" w:bottom="288" w:left="288" w:header="720" w:footer="720" w:gutter="0"/>
       <w:cols w:space="720"/>
       <w:docGrid w:linePitch="360"/>
     </w:sectPr>
@@ -1760,31 +2304,31 @@
       </w:rPr>
     </w:lvl>
   </w:abstractNum>
-  <w:num w:numId="1" w16cid:durableId="1154105794">
+  <w:num w:numId="1" w16cid:durableId="1102652918">
     <w:abstractNumId w:val="8"/>
   </w:num>
-  <w:num w:numId="2" w16cid:durableId="1015545876">
+  <w:num w:numId="2" w16cid:durableId="1943032171">
     <w:abstractNumId w:val="6"/>
   </w:num>
-  <w:num w:numId="3" w16cid:durableId="1748335844">
+  <w:num w:numId="3" w16cid:durableId="615914460">
     <w:abstractNumId w:val="5"/>
   </w:num>
-  <w:num w:numId="4" w16cid:durableId="1693066790">
+  <w:num w:numId="4" w16cid:durableId="999116959">
     <w:abstractNumId w:val="4"/>
   </w:num>
-  <w:num w:numId="5" w16cid:durableId="1225679033">
+  <w:num w:numId="5" w16cid:durableId="410742594">
     <w:abstractNumId w:val="7"/>
   </w:num>
-  <w:num w:numId="6" w16cid:durableId="1627202304">
+  <w:num w:numId="6" w16cid:durableId="1414818138">
     <w:abstractNumId w:val="3"/>
   </w:num>
-  <w:num w:numId="7" w16cid:durableId="1540127508">
+  <w:num w:numId="7" w16cid:durableId="1494300081">
     <w:abstractNumId w:val="2"/>
   </w:num>
-  <w:num w:numId="8" w16cid:durableId="1362971885">
+  <w:num w:numId="8" w16cid:durableId="1415396943">
     <w:abstractNumId w:val="1"/>
   </w:num>
-  <w:num w:numId="9" w16cid:durableId="884562101">
+  <w:num w:numId="9" w16cid:durableId="1735087015">
     <w:abstractNumId w:val="0"/>
   </w:num>
 </w:numbering>

</xml_diff>